<commit_message>
Add SAM-Body4D as future enhancement to architecture doc (Section 17)
Covers 4D mesh recovery pipeline, fencing-specific value, hardware
requirements (24GB VRAM min), GPU rental approach, and placement
as optional post-Stage 4 enrichment layer.

Co-Authored-By: Claude Sonnet 4.6 <noreply@anthropic.com>
</commit_message>
<xml_diff>
--- a/documents/fencing_analyzer_architecture.docx
+++ b/documents/fencing_analyzer_architecture.docx
@@ -15660,6 +15660,301 @@
         <w:t xml:space="preserve">Export for coaches: summary report format suitable for coach review and annotation</w:t>
       </w:r>
     </w:p>
+    <w:p>
+      <w:pPr>
+        <w:pStyle w:val="Heading1"/>
+      </w:pPr>
+      <w:r>
+        <w:t xml:space="preserve">17. Future Enhancement: SAM-Body4D 4D Mesh Recovery</w:t>
+      </w:r>
+    </w:p>
+    <w:p/>
+    <w:p>
+      <w:r>
+        <w:t xml:space="preserve">SAM-Body4D (https://github.com/gaomingqi/sam-body4d) is a training-free framework for temporally consistent 4D human body mesh recovery from video. It chains three foundation models in sequence — SAM 3 for video segmentation, SAM 3D Body for 3D mesh recovery, and Diffusion-VAS for occlusion recovery — producing a richly structured output that goes well beyond what frame-by-frame 2D pose estimation can offer.</w:t>
+      </w:r>
+    </w:p>
+    <w:p/>
+    <w:p>
+      <w:pPr>
+        <w:pStyle w:val="Heading2"/>
+      </w:pPr>
+      <w:r>
+        <w:t xml:space="preserve">17.1 What SAM-Body4D Provides</w:t>
+      </w:r>
+    </w:p>
+    <w:p/>
+    <w:p>
+      <w:r>
+        <w:t xml:space="preserve">Unlike YOLOv8-Pose, which outputs 17 COCO keypoints per frame independently with no cross-frame coherence, SAM-Body4D produces a temporally consistent 4D representation across the entire video clip. Its per-frame output includes:</w:t>
+      </w:r>
+    </w:p>
+    <w:p/>
+    <w:p>
+      <w:pPr>
+        <w:pStyle w:val="ListParagraph"/>
+      </w:pPr>
+      <w:r>
+        <w:t xml:space="preserve">Full 3D mesh vertices — a dense surface model of the human body, not just skeletal landmarks</w:t>
+      </w:r>
+    </w:p>
+    <w:p>
+      <w:pPr>
+        <w:pStyle w:val="ListParagraph"/>
+      </w:pPr>
+      <w:r>
+        <w:t xml:space="preserve">Joint rotations expressed as Euler angles — enabling true 3D joint angle measurement</w:t>
+      </w:r>
+    </w:p>
+    <w:p>
+      <w:pPr>
+        <w:pStyle w:val="ListParagraph"/>
+      </w:pPr>
+      <w:r>
+        <w:t xml:space="preserve">SMPL-family pose parameters — compatible with standard biomechanical analysis pipelines</w:t>
+      </w:r>
+    </w:p>
+    <w:p>
+      <w:pPr>
+        <w:pStyle w:val="ListParagraph"/>
+      </w:pPr>
+      <w:r>
+        <w:t xml:space="preserve">Camera pose — world-space position and orientation per frame</w:t>
+      </w:r>
+    </w:p>
+    <w:p>
+      <w:pPr>
+        <w:pStyle w:val="ListParagraph"/>
+      </w:pPr>
+      <w:r>
+        <w:t xml:space="preserve">Temporal consistency — body identity and pose tracked coherently across frames, eliminating per-frame jitter</w:t>
+      </w:r>
+    </w:p>
+    <w:p/>
+    <w:p>
+      <w:pPr>
+        <w:pStyle w:val="Heading2"/>
+      </w:pPr>
+      <w:r>
+        <w:t xml:space="preserve">17.2 Fencing-Specific Value</w:t>
+      </w:r>
+    </w:p>
+    <w:p/>
+    <w:p>
+      <w:r>
+        <w:t xml:space="preserve">For fencing analysis, the upgrade from 2D keypoints to 3D mesh recovery enables a class of measurements that are not possible with the current YOLOv8-Pose pipeline:</w:t>
+      </w:r>
+    </w:p>
+    <w:p/>
+    <w:p>
+      <w:pPr>
+        <w:pStyle w:val="ListParagraph"/>
+      </w:pPr>
+      <w:r>
+        <w:t xml:space="preserve">3D joint angle analysis: knee bend, elbow extension, and shoulder rotation measured in true 3D space rather than projected 2D angles, which are distorted by camera angle</w:t>
+      </w:r>
+    </w:p>
+    <w:p>
+      <w:pPr>
+        <w:pStyle w:val="ListParagraph"/>
+      </w:pPr>
+      <w:r>
+        <w:t xml:space="preserve">Torso rotation during the lunge: the degree of shoulder-hip counter-rotation, which is a key efficiency indicator in epee, becomes directly measurable</w:t>
+      </w:r>
+    </w:p>
+    <w:p>
+      <w:pPr>
+        <w:pStyle w:val="ListParagraph"/>
+      </w:pPr>
+      <w:r>
+        <w:t xml:space="preserve">Arm extension measurement: weapon arm reach captured as a 3D vector, giving more accurate extension distance than 2D projection</w:t>
+      </w:r>
+    </w:p>
+    <w:p>
+      <w:pPr>
+        <w:pStyle w:val="ListParagraph"/>
+      </w:pPr>
+      <w:r>
+        <w:t xml:space="preserve">Weight distribution shifts: subtle fore-aft and lateral balance changes visible in 3D mesh deformation patterns</w:t>
+      </w:r>
+    </w:p>
+    <w:p>
+      <w:pPr>
+        <w:pStyle w:val="ListParagraph"/>
+      </w:pPr>
+      <w:r>
+        <w:t xml:space="preserve">Richer multi-person relative positioning: when two fencers are in frame, true 3D separation and facing direction between them</w:t>
+      </w:r>
+    </w:p>
+    <w:p/>
+    <w:p>
+      <w:pPr>
+        <w:pStyle w:val="Heading2"/>
+      </w:pPr>
+      <w:r>
+        <w:t xml:space="preserve">17.3 Hardware Requirements</w:t>
+      </w:r>
+    </w:p>
+    <w:p/>
+    <w:p>
+      <w:r>
+        <w:t xml:space="preserve">SAM-Body4D chains three large foundation models, making it substantially more demanding than the current YOLOv8-Pose pipeline. Hardware requirements are as follows:</w:t>
+      </w:r>
+    </w:p>
+    <w:p/>
+    <w:p>
+      <w:pPr>
+        <w:pStyle w:val="ListParagraph"/>
+      </w:pPr>
+      <w:r>
+        <w:t xml:space="preserve">Minimum recommended: 24 GB VRAM (RTX 4090 or RTX 3090) for reliable full-feature operation</w:t>
+      </w:r>
+    </w:p>
+    <w:p>
+      <w:pPr>
+        <w:pStyle w:val="ListParagraph"/>
+      </w:pPr>
+      <w:r>
+        <w:t xml:space="preserve">Current development GPU (RTX 4070 Super, 12 GB): insufficient for reliable operation — VRAM ceiling will be exceeded for typical video lengths and model configurations</w:t>
+      </w:r>
+    </w:p>
+    <w:p>
+      <w:pPr>
+        <w:pStyle w:val="ListParagraph"/>
+      </w:pPr>
+      <w:r>
+        <w:t xml:space="preserve">CPU fallback: possible in principle but impractically slow for anything beyond short clips</w:t>
+      </w:r>
+    </w:p>
+    <w:p/>
+    <w:p>
+      <w:pPr>
+        <w:pStyle w:val="Heading2"/>
+      </w:pPr>
+      <w:r>
+        <w:t xml:space="preserve">17.4 Recommended Integration Approach</w:t>
+      </w:r>
+    </w:p>
+    <w:p/>
+    <w:p>
+      <w:r>
+        <w:t xml:space="preserve">Given the hardware constraints, SAM-Body4D is best treated as an offline post-processing enrichment layer rather than a component in the main real-time or near-real-time pipeline. The recommended approach:</w:t>
+      </w:r>
+    </w:p>
+    <w:p/>
+    <w:p>
+      <w:pPr>
+        <w:pStyle w:val="ListParagraph"/>
+      </w:pPr>
+      <w:r>
+        <w:t xml:space="preserve">Offline batch processing only: do not attempt real-time or near-real-time use; run as a separate, triggered job after bout upload and standard analysis are complete</w:t>
+      </w:r>
+    </w:p>
+    <w:p>
+      <w:pPr>
+        <w:pStyle w:val="ListParagraph"/>
+      </w:pPr>
+      <w:r>
+        <w:t xml:space="preserve">Selective application: apply only to high-value moments identified by the Stage 4 threat analysis — full-bout processing is unnecessary and expensive</w:t>
+      </w:r>
+    </w:p>
+    <w:p>
+      <w:pPr>
+        <w:pStyle w:val="ListParagraph"/>
+      </w:pPr>
+      <w:r>
+        <w:t xml:space="preserve">GPU rental via RunPod or Vast.ai: 24 GB GPU instances are available at approximately $0.40–$0.80/hr, making occasional deep-analysis runs affordable without a hardware upgrade</w:t>
+      </w:r>
+    </w:p>
+    <w:p>
+      <w:pPr>
+        <w:pStyle w:val="ListParagraph"/>
+      </w:pPr>
+      <w:r>
+        <w:t xml:space="preserve">Results stored as supplementary data: the 3D mesh and pose parameter outputs are stored alongside existing per-frame records and surfaced as an optional enriched view in the UI</w:t>
+      </w:r>
+    </w:p>
+    <w:p/>
+    <w:p>
+      <w:pPr>
+        <w:pStyle w:val="Heading2"/>
+      </w:pPr>
+      <w:r>
+        <w:t xml:space="preserve">17.5 Relationship to YOLOv8-Pose</w:t>
+      </w:r>
+    </w:p>
+    <w:p/>
+    <w:p>
+      <w:r>
+        <w:t xml:space="preserve">SAM-Body4D is not a replacement for YOLOv8-Pose. The two models serve complementary roles:</w:t>
+      </w:r>
+    </w:p>
+    <w:p/>
+    <w:p>
+      <w:pPr>
+        <w:pStyle w:val="ListParagraph"/>
+      </w:pPr>
+      <w:r>
+        <w:t xml:space="preserve">YOLOv8-Pose remains the primary pipeline engine: fast, GPU-efficient, sufficient for real-time and near-real-time use, and adequate for the majority of coaching feedback</w:t>
+      </w:r>
+    </w:p>
+    <w:p>
+      <w:pPr>
+        <w:pStyle w:val="ListParagraph"/>
+      </w:pPr>
+      <w:r>
+        <w:t xml:space="preserve">SAM-Body4D is an optional enrichment layer: applied selectively after the fact, it upgrades the depth of analysis for specific high-value moments without disrupting the core pipeline</w:t>
+      </w:r>
+    </w:p>
+    <w:p>
+      <w:pPr>
+        <w:pStyle w:val="ListParagraph"/>
+      </w:pPr>
+      <w:r>
+        <w:t xml:space="preserve">The two outputs are complementary: 2D keypoint timelines from YOLOv8-Pose provide the foundation; 3D mesh data from SAM-Body4D adds a biomechanical depth layer on top</w:t>
+      </w:r>
+    </w:p>
+    <w:p/>
+    <w:p>
+      <w:pPr>
+        <w:pStyle w:val="Heading2"/>
+      </w:pPr>
+      <w:r>
+        <w:t xml:space="preserve">17.6 Placement in Development Roadmap</w:t>
+      </w:r>
+    </w:p>
+    <w:p/>
+    <w:p>
+      <w:r>
+        <w:t xml:space="preserve">SAM-Body4D integration is recommended as an optional advanced analysis pass after Stage 4 (threat analysis and opponent decision tree). At that point the core pipeline is mature, bout-level analysis is stable, and the high-value moments to target with deep 3D analysis are well-defined. It is explicitly out of scope for Stages 1 through 4.</w:t>
+      </w:r>
+    </w:p>
+    <w:p/>
+    <w:p>
+      <w:pPr>
+        <w:pStyle w:val="ListParagraph"/>
+      </w:pPr>
+      <w:r>
+        <w:t xml:space="preserve">Stage 1–4: out of scope; no dependency on SAM-Body4D</w:t>
+      </w:r>
+    </w:p>
+    <w:p>
+      <w:pPr>
+        <w:pStyle w:val="ListParagraph"/>
+      </w:pPr>
+      <w:r>
+        <w:t xml:space="preserve">Post-Stage 4 (optional): integrate as a triggered batch job, surfaced in the UI as an "Enhanced 3D Analysis" option on supported bout segments</w:t>
+      </w:r>
+    </w:p>
+    <w:p>
+      <w:pPr>
+        <w:pStyle w:val="ListParagraph"/>
+      </w:pPr>
+      <w:r>
+        <w:t xml:space="preserve">GPU rental is the recommended compute strategy until hardware is upgraded beyond the 12 GB VRAM ceiling</w:t>
+      </w:r>
+    </w:p>
+    <w:p/>
     <w:p>
       <w:r>
         <w:t xml:space="preserve"/>

</xml_diff>